<commit_message>
chore: rename workspace file and update requirements artifacts
</commit_message>
<xml_diff>
--- a/docs/Requirements.docx
+++ b/docs/Requirements.docx
@@ -343,6 +343,110 @@
       <w:pPr>
         <w:pStyle w:val="ListParagraph"/>
         <w:numPr>
+          <w:ilvl w:val="1"/>
+          <w:numId w:val="1"/>
+        </w:numPr>
+      </w:pPr>
+      <w:r>
+        <w:t xml:space="preserve">rename all the </w:t>
+      </w:r>
+      <w:proofErr w:type="spellStart"/>
+      <w:r>
+        <w:t>resoruce</w:t>
+      </w:r>
+      <w:proofErr w:type="spellEnd"/>
+      <w:r>
+        <w:t xml:space="preserve"> groups and </w:t>
+      </w:r>
+      <w:proofErr w:type="gramStart"/>
+      <w:r>
+        <w:t>resources</w:t>
+      </w:r>
+      <w:proofErr w:type="gramEnd"/>
+      <w:r>
+        <w:t xml:space="preserve"> </w:t>
+      </w:r>
+      <w:proofErr w:type="gramStart"/>
+      <w:r>
+        <w:t>accordingly ,</w:t>
+      </w:r>
+      <w:proofErr w:type="gramEnd"/>
+      <w:r>
+        <w:t xml:space="preserve"> may be prefix with canary or prod.</w:t>
+      </w:r>
+      <w:r>
+        <w:br/>
+        <w:t xml:space="preserve">And </w:t>
+      </w:r>
+      <w:proofErr w:type="spellStart"/>
+      <w:r>
+        <w:t>dont</w:t>
+      </w:r>
+      <w:proofErr w:type="spellEnd"/>
+      <w:r>
+        <w:t xml:space="preserve"> use prod environment without </w:t>
+      </w:r>
+      <w:proofErr w:type="spellStart"/>
+      <w:r>
+        <w:t>approovals</w:t>
+      </w:r>
+      <w:proofErr w:type="spellEnd"/>
+      <w:r>
+        <w:t xml:space="preserve">. only when well tested version is to be </w:t>
+      </w:r>
+      <w:proofErr w:type="spellStart"/>
+      <w:r>
+        <w:t>rleeased</w:t>
+      </w:r>
+      <w:proofErr w:type="spellEnd"/>
+      <w:r>
+        <w:t xml:space="preserve"> to prod - </w:t>
+      </w:r>
+      <w:proofErr w:type="spellStart"/>
+      <w:r>
+        <w:t>crete</w:t>
+      </w:r>
+      <w:proofErr w:type="spellEnd"/>
+      <w:r>
+        <w:t xml:space="preserve"> a </w:t>
+      </w:r>
+      <w:proofErr w:type="spellStart"/>
+      <w:r>
+        <w:t>welld</w:t>
+      </w:r>
+      <w:proofErr w:type="spellEnd"/>
+      <w:r>
+        <w:t xml:space="preserve"> </w:t>
+      </w:r>
+      <w:proofErr w:type="spellStart"/>
+      <w:r>
+        <w:t>efined</w:t>
+      </w:r>
+      <w:proofErr w:type="spellEnd"/>
+      <w:r>
+        <w:t xml:space="preserve"> right process to push </w:t>
+      </w:r>
+      <w:proofErr w:type="spellStart"/>
+      <w:r>
+        <w:t>chnages</w:t>
+      </w:r>
+      <w:proofErr w:type="spellEnd"/>
+      <w:r>
+        <w:t xml:space="preserve"> to </w:t>
+      </w:r>
+      <w:proofErr w:type="gramStart"/>
+      <w:r>
+        <w:t>prod, and</w:t>
+      </w:r>
+      <w:proofErr w:type="gramEnd"/>
+      <w:r>
+        <w:t xml:space="preserve"> include a manual approval from me for every prod deployment.</w:t>
+      </w:r>
+    </w:p>
+    <w:p>
+      <w:pPr>
+        <w:pStyle w:val="ListParagraph"/>
+        <w:numPr>
           <w:ilvl w:val="0"/>
           <w:numId w:val="1"/>
         </w:numPr>
@@ -379,14 +483,347 @@
         <w:t xml:space="preserve"> and similar modern travel websites</w:t>
       </w:r>
     </w:p>
-    <w:p>
-      <w:pPr>
-        <w:pStyle w:val="ListParagraph"/>
-        <w:numPr>
-          <w:ilvl w:val="1"/>
-          <w:numId w:val="1"/>
-        </w:numPr>
-      </w:pPr>
+    <w:p/>
+    <w:p/>
+    <w:p/>
+    <w:p/>
+    <w:p>
+      <w:r>
+        <w:t xml:space="preserve">Clicking on place item on itinerary should show it on the map </w:t>
+      </w:r>
+      <w:proofErr w:type="gramStart"/>
+      <w:r>
+        <w:t>and also</w:t>
+      </w:r>
+      <w:proofErr w:type="gramEnd"/>
+      <w:r>
+        <w:t xml:space="preserve"> in details section - details about that place.</w:t>
+      </w:r>
+    </w:p>
+    <w:p>
+      <w:proofErr w:type="gramStart"/>
+      <w:r>
+        <w:t>Also</w:t>
+      </w:r>
+      <w:proofErr w:type="gramEnd"/>
+      <w:r>
+        <w:t xml:space="preserve"> on the map can you mark the order of visiting in the circuit, </w:t>
+      </w:r>
+      <w:proofErr w:type="spellStart"/>
+      <w:r>
+        <w:t>curently</w:t>
+      </w:r>
+      <w:proofErr w:type="spellEnd"/>
+      <w:r>
+        <w:t xml:space="preserve"> it is not clear where to start and what is next.</w:t>
+      </w:r>
+    </w:p>
+    <w:p>
+      <w:r>
+        <w:t xml:space="preserve">Also let's </w:t>
+      </w:r>
+      <w:proofErr w:type="spellStart"/>
+      <w:r>
+        <w:t>seperate</w:t>
+      </w:r>
+      <w:proofErr w:type="spellEnd"/>
+      <w:r>
+        <w:t xml:space="preserve"> out the itinerary section - reduce the chat section vertical size to half and place the itinerary as a </w:t>
+      </w:r>
+      <w:proofErr w:type="spellStart"/>
+      <w:r>
+        <w:t>seperate</w:t>
+      </w:r>
+      <w:proofErr w:type="spellEnd"/>
+      <w:r>
+        <w:t xml:space="preserve"> section int he upper half. All these sections should </w:t>
+      </w:r>
+      <w:proofErr w:type="spellStart"/>
+      <w:r>
+        <w:t>eb</w:t>
+      </w:r>
+      <w:proofErr w:type="spellEnd"/>
+      <w:r>
+        <w:t xml:space="preserve"> resizable on length and breadth side, be able to make full </w:t>
+      </w:r>
+      <w:proofErr w:type="spellStart"/>
+      <w:r>
+        <w:t>scren</w:t>
+      </w:r>
+      <w:proofErr w:type="spellEnd"/>
+      <w:r>
+        <w:t xml:space="preserve"> etc.</w:t>
+      </w:r>
+      <w:proofErr w:type="gramStart"/>
+      <w:r>
+        <w:t xml:space="preserve"> giving</w:t>
+      </w:r>
+      <w:proofErr w:type="gramEnd"/>
+      <w:r>
+        <w:t xml:space="preserve"> the standard flexibility to </w:t>
+      </w:r>
+      <w:proofErr w:type="gramStart"/>
+      <w:r>
+        <w:t>user</w:t>
+      </w:r>
+      <w:proofErr w:type="gramEnd"/>
+      <w:r>
+        <w:t xml:space="preserve"> for such UI components.</w:t>
+      </w:r>
+    </w:p>
+    <w:p>
+      <w:r>
+        <w:t xml:space="preserve">On the right side split into 2 sections the top half being the map (it </w:t>
+      </w:r>
+      <w:proofErr w:type="spellStart"/>
+      <w:r>
+        <w:t>iis</w:t>
+      </w:r>
+      <w:proofErr w:type="spellEnd"/>
+      <w:r>
+        <w:t xml:space="preserve"> not hidden, </w:t>
+      </w:r>
+      <w:proofErr w:type="spellStart"/>
+      <w:r>
+        <w:t>continuoussly</w:t>
+      </w:r>
+      <w:proofErr w:type="spellEnd"/>
+      <w:r>
+        <w:t xml:space="preserve"> show (</w:t>
+      </w:r>
+      <w:proofErr w:type="gramStart"/>
+      <w:r>
+        <w:t>but yet</w:t>
+      </w:r>
+      <w:proofErr w:type="gramEnd"/>
+      <w:r>
+        <w:t xml:space="preserve"> with option to hide)). Bottom half for the place's details section including photos, reviews, </w:t>
+      </w:r>
+      <w:proofErr w:type="spellStart"/>
+      <w:r>
+        <w:t>descriptiojn</w:t>
+      </w:r>
+      <w:proofErr w:type="spellEnd"/>
+      <w:r>
+        <w:t xml:space="preserve"> etc. depending on place type the </w:t>
+      </w:r>
+      <w:proofErr w:type="spellStart"/>
+      <w:r>
+        <w:t>drelevant</w:t>
+      </w:r>
+      <w:proofErr w:type="spellEnd"/>
+      <w:r>
+        <w:t xml:space="preserve"> </w:t>
+      </w:r>
+      <w:proofErr w:type="spellStart"/>
+      <w:r>
+        <w:lastRenderedPageBreak/>
+        <w:t>descriptiovbe</w:t>
+      </w:r>
+      <w:proofErr w:type="spellEnd"/>
+      <w:r>
+        <w:t xml:space="preserve"> </w:t>
+      </w:r>
+      <w:proofErr w:type="spellStart"/>
+      <w:r>
+        <w:t>adata</w:t>
+      </w:r>
+      <w:proofErr w:type="spellEnd"/>
+      <w:r>
+        <w:t xml:space="preserve">, e.g. for hotels it will be </w:t>
+      </w:r>
+      <w:proofErr w:type="spellStart"/>
+      <w:r>
+        <w:t>proice</w:t>
+      </w:r>
+      <w:proofErr w:type="spellEnd"/>
+      <w:r>
+        <w:t xml:space="preserve">, for museum/parks it will be ticket and opening </w:t>
+      </w:r>
+      <w:proofErr w:type="spellStart"/>
+      <w:r>
+        <w:t>timeings</w:t>
+      </w:r>
+      <w:proofErr w:type="spellEnd"/>
+      <w:r>
+        <w:t xml:space="preserve">, for restaurant/cafe it will be </w:t>
+      </w:r>
+      <w:proofErr w:type="spellStart"/>
+      <w:r>
+        <w:t>wapprox</w:t>
+      </w:r>
+      <w:proofErr w:type="spellEnd"/>
+      <w:r>
+        <w:t xml:space="preserve"> cost, open timings, etc.</w:t>
+      </w:r>
+    </w:p>
+    <w:p/>
+    <w:p/>
+    <w:p/>
+    <w:p/>
+    <w:p>
+      <w:r>
+        <w:t xml:space="preserve">clicking on the numbered </w:t>
+      </w:r>
+      <w:proofErr w:type="gramStart"/>
+      <w:r>
+        <w:t>day ,</w:t>
+      </w:r>
+      <w:proofErr w:type="gramEnd"/>
+      <w:r>
+        <w:t xml:space="preserve"> or the itinerary place should zoom into map at that place by default. It currently only shows a tile on the map, should zoom too.</w:t>
+      </w:r>
+      <w:r>
+        <w:br/>
+        <w:t xml:space="preserve">What for are </w:t>
+      </w:r>
+      <w:proofErr w:type="spellStart"/>
+      <w:r>
+        <w:t>trhe</w:t>
+      </w:r>
+      <w:proofErr w:type="spellEnd"/>
+      <w:r>
+        <w:t xml:space="preserve"> check boxes </w:t>
+      </w:r>
+      <w:proofErr w:type="spellStart"/>
+      <w:r>
+        <w:t>gfivdsen</w:t>
+      </w:r>
+      <w:proofErr w:type="spellEnd"/>
+      <w:r>
+        <w:t xml:space="preserve"> on the itinerary list of places ?</w:t>
+      </w:r>
+      <w:r>
+        <w:br/>
+        <w:t xml:space="preserve">From </w:t>
+      </w:r>
+      <w:proofErr w:type="spellStart"/>
+      <w:r>
+        <w:t>teh</w:t>
+      </w:r>
+      <w:proofErr w:type="spellEnd"/>
+      <w:r>
+        <w:t xml:space="preserve"> details section, if I do add to trip , can it add intelligently to the right day and stop number based on cluster minimizing the distance and hassle, maximizing the comfort, If with adding this new </w:t>
+      </w:r>
+      <w:proofErr w:type="spellStart"/>
+      <w:r>
+        <w:t>additon</w:t>
+      </w:r>
+      <w:proofErr w:type="spellEnd"/>
+      <w:r>
+        <w:t xml:space="preserve">, the itinerary starts becoming too packed then present a </w:t>
+      </w:r>
+      <w:proofErr w:type="spellStart"/>
+      <w:r>
+        <w:t>selextion</w:t>
+      </w:r>
+      <w:proofErr w:type="spellEnd"/>
+      <w:r>
+        <w:t xml:space="preserve"> choice to user to remove an attraction/place etc. form that day , if user </w:t>
+      </w:r>
+      <w:proofErr w:type="spellStart"/>
+      <w:r>
+        <w:t>doesnt</w:t>
+      </w:r>
+      <w:proofErr w:type="spellEnd"/>
+      <w:r>
+        <w:t xml:space="preserve"> want to decide then intelligently you should be able to make the choice and remove what you think is the right thing</w:t>
+      </w:r>
+    </w:p>
+    <w:p/>
+    <w:p>
+      <w:r>
+        <w:br w:type="page"/>
+      </w:r>
+    </w:p>
+    <w:p>
+      <w:proofErr w:type="gramStart"/>
+      <w:r>
+        <w:lastRenderedPageBreak/>
+        <w:t>yes</w:t>
+      </w:r>
+      <w:proofErr w:type="gramEnd"/>
+      <w:r>
+        <w:t xml:space="preserve"> add </w:t>
+      </w:r>
+      <w:proofErr w:type="gramStart"/>
+      <w:r>
+        <w:t>those, and</w:t>
+      </w:r>
+      <w:proofErr w:type="gramEnd"/>
+      <w:r>
+        <w:t xml:space="preserve"> allow hiding and showing a particular pane </w:t>
+      </w:r>
+      <w:proofErr w:type="gramStart"/>
+      <w:r>
+        <w:t>in order to</w:t>
+      </w:r>
+      <w:proofErr w:type="gramEnd"/>
+      <w:r>
+        <w:t xml:space="preserve"> </w:t>
+      </w:r>
+      <w:proofErr w:type="spellStart"/>
+      <w:r>
+        <w:t>givde</w:t>
+      </w:r>
+      <w:proofErr w:type="spellEnd"/>
+      <w:r>
+        <w:t xml:space="preserve"> flexibility to user to increase area for other </w:t>
+      </w:r>
+      <w:proofErr w:type="gramStart"/>
+      <w:r>
+        <w:t>panes</w:t>
+      </w:r>
+      <w:proofErr w:type="gramEnd"/>
+      <w:r>
+        <w:t xml:space="preserve">. all 4 panels (or panes or sections) whatever you call it should be </w:t>
+      </w:r>
+      <w:proofErr w:type="spellStart"/>
+      <w:r>
+        <w:t>flexib.ele</w:t>
+      </w:r>
+      <w:proofErr w:type="spellEnd"/>
+      <w:r>
+        <w:t xml:space="preserve"> to resize maximize hide, show move</w:t>
+      </w:r>
+    </w:p>
+    <w:p/>
+    <w:p/>
+    <w:p>
+      <w:proofErr w:type="gramStart"/>
+      <w:r>
+        <w:t>let's</w:t>
+      </w:r>
+      <w:proofErr w:type="gramEnd"/>
+      <w:r>
+        <w:t xml:space="preserve"> work on an export itinerary feature: when user clicks export - give option to select pictures etc. or simply the day wise itinerary + map circuit for each day under each day. The purpose is for </w:t>
+      </w:r>
+      <w:proofErr w:type="gramStart"/>
+      <w:r>
+        <w:t>user</w:t>
+      </w:r>
+      <w:proofErr w:type="gramEnd"/>
+      <w:r>
+        <w:t xml:space="preserve"> to export it nicely </w:t>
+      </w:r>
+      <w:proofErr w:type="spellStart"/>
+      <w:proofErr w:type="gramStart"/>
+      <w:r>
+        <w:t>ina</w:t>
+      </w:r>
+      <w:proofErr w:type="spellEnd"/>
+      <w:proofErr w:type="gramEnd"/>
+      <w:r>
+        <w:t xml:space="preserve"> pdf format and take it away for a printout and carry along for reference. Also provide </w:t>
+      </w:r>
+      <w:proofErr w:type="gramStart"/>
+      <w:r>
+        <w:t>option</w:t>
+      </w:r>
+      <w:proofErr w:type="gramEnd"/>
+      <w:r>
+        <w:t xml:space="preserve"> to send it to their email.</w:t>
+      </w:r>
     </w:p>
     <w:sectPr>
       <w:pgSz w:w="12240" w:h="15840"/>
@@ -1098,7 +1535,6 @@
   <w:style w:type="character" w:default="1" w:styleId="DefaultParagraphFont">
     <w:name w:val="Default Paragraph Font"/>
     <w:uiPriority w:val="1"/>
-    <w:semiHidden/>
     <w:unhideWhenUsed/>
   </w:style>
   <w:style w:type="table" w:default="1" w:styleId="TableNormal">

</xml_diff>